<commit_message>
3rd-draft: reword Fig. 6 caption and the paragraph after it; log Predict2 vs 2.5 question
Fig. 6 caption now ends "source (left) and variant (right)". The paragraph after
Fig. 6 describes the black-to-blue permutation of background items on the
cable-winding clip. Applied in main.tex, the markdown, alt-text.csv, and the
rebuilt PDF and DOCX (10 pages, layout unchanged).

changes.md: new Sec. 5 with the before/after text, and open decision 4 on whether
the action model was Cosmos Predict2 (as in Shrey's written answers and ref 7) or
Predict2.5, which is a separate, later release.
</commit_message>
<xml_diff>
--- a/oct-27/3rd-draft/AIPR 2026 Paper-3rd-draft.docx
+++ b/oct-27/3rd-draft/AIPR 2026 Paper-3rd-draft.docx
@@ -800,15 +800,15 @@
           <w:i/>
           <w:iCs/>
         </w:rPr>
-        <w:t xml:space="preserve">Fig. 6. Another example of color permutation, on the cable-winding clip: source (left) and variant with the desk and shelf recolored blue (right).</w:t>
-      </w:r>
-    </w:p>
-    <w:p>
-      <w:pPr>
-        <w:pStyle w:val="BodyText"/>
-      </w:pPr>
-      <w:r>
-        <w:t xml:space="preserve">Fig. 6 shows the same kind of appearance change on the cable-winding clip: the desk and shelf are recolored and the hands and cable are preserved. We used this clip to test a change of a different kind.</w:t>
+        <w:t xml:space="preserve">Fig. 6. Another example of color permutation, on the cable-winding clip: source (left) and variant (right).</w:t>
+      </w:r>
+    </w:p>
+    <w:p>
+      <w:pPr>
+        <w:pStyle w:val="BodyText"/>
+      </w:pPr>
+      <w:r>
+        <w:t xml:space="preserve">Fig. 6 illustrates another appearance change, this time on the color of background items. When we prompt to permute the color of some background items within the cable-winding clip from black to blue, we see the desk, shelf, hands and cable are preserved, while some of the black colored items are altered.</w:t>
       </w:r>
     </w:p>
     <w:p>

</xml_diff>